<commit_message>
report: add hw/sw env + min memory, baseline comparison table, TTFT/TPS curves vs concurrency and input length
</commit_message>
<xml_diff>
--- a/hicache_agentic_test_report.docx
+++ b/hicache_agentic_test_report.docx
@@ -31,6 +31,14 @@
         <w:t>1.1 测试环境</w:t>
       </w:r>
     </w:p>
+    <w:p>
+      <w:r>
+        <w:rPr>
+          <w:b/>
+        </w:rPr>
+        <w:t>硬件</w:t>
+      </w:r>
+    </w:p>
     <w:tbl>
       <w:tblPr>
         <w:tblStyle w:val="TableGrid"/>
@@ -119,7 +127,7 @@
               <w:rPr>
                 <w:sz w:val="19"/>
               </w:rPr>
-              <w:t>2× NVIDIA L20 48GB，TP=2</w:t>
+              <w:t>2× NVIDIA L20 48GB（TP=2），驱动 570.195.03 / CUDA 12.8</w:t>
             </w:r>
           </w:p>
         </w:tc>
@@ -139,7 +147,7 @@
               <w:rPr>
                 <w:sz w:val="19"/>
               </w:rPr>
-              <w:t>模型</w:t>
+              <w:t>CPU</w:t>
             </w:r>
           </w:p>
         </w:tc>
@@ -157,7 +165,7 @@
               <w:rPr>
                 <w:sz w:val="19"/>
               </w:rPr>
-              <w:t>DeepSeek-V4-Flash（43 层混合架构，sliding_window=128，MLA kv_heads=1 / head_dim=512）</w:t>
+              <w:t>2× Intel Xeon 6767P（256 逻辑核 / 4 NUMA，支持 AMX）</w:t>
             </w:r>
           </w:p>
         </w:tc>
@@ -177,7 +185,7 @@
               <w:rPr>
                 <w:sz w:val="19"/>
               </w:rPr>
-              <w:t>量化/加速</w:t>
+              <w:t>内存</w:t>
             </w:r>
           </w:p>
         </w:tc>
@@ -195,14 +203,7 @@
               <w:rPr>
                 <w:sz w:val="19"/>
               </w:rPr>
-              <w:t>KT MXFP4，</w:t>
-            </w:r>
-            <w:r>
-              <w:rPr>
-                <w:rFonts w:ascii="Consolas" w:hAnsi="Consolas" w:eastAsia="宋体"/>
-                <w:sz w:val="19"/>
-              </w:rPr>
-              <w:t>--kt-num-gpu-experts 30 --kt-cpuinfer 128 --kt-threadpool-count 4 --kt-enable-dynamic-expert-update</w:t>
+              <w:t>1006GB（4 NUMA 节点交错，host 池 + cudaHostRegister）</w:t>
             </w:r>
           </w:p>
         </w:tc>
@@ -222,7 +223,7 @@
               <w:rPr>
                 <w:sz w:val="19"/>
               </w:rPr>
-              <w:t>KV 池（L1）</w:t>
+              <w:t>模型权重</w:t>
             </w:r>
           </w:p>
         </w:tc>
@@ -238,16 +239,74 @@
             </w:r>
             <w:r>
               <w:rPr>
-                <w:rFonts w:ascii="Consolas" w:hAnsi="Consolas" w:eastAsia="宋体"/>
-                <w:sz w:val="19"/>
-              </w:rPr>
-              <w:t>--max-total-tokens 131072 --swa-full-tokens-ratio 1.0</w:t>
-            </w:r>
-            <w:r>
-              <w:rPr>
-                <w:sz w:val="19"/>
-              </w:rPr>
-              <w:t>（full/swa 各 131k）</w:t>
+                <w:sz w:val="19"/>
+              </w:rPr>
+              <w:t>DeepSeek-V4-Flash，磁盘占用 149GB（MXFP4 专家 + BF16 注意力混合精度），常驻主机内存</w:t>
+            </w:r>
+          </w:p>
+        </w:tc>
+      </w:tr>
+    </w:tbl>
+    <w:p/>
+    <w:p>
+      <w:r>
+        <w:rPr>
+          <w:b/>
+        </w:rPr>
+        <w:t>软件</w:t>
+      </w:r>
+    </w:p>
+    <w:tbl>
+      <w:tblPr>
+        <w:tblStyle w:val="TableGrid"/>
+        <w:tblW w:type="auto" w:w="0"/>
+        <w:jc w:val="center"/>
+        <w:tblLook w:firstColumn="1" w:firstRow="1" w:lastColumn="0" w:lastRow="0" w:noHBand="0" w:noVBand="1" w:val="04A0"/>
+      </w:tblPr>
+      <w:tblGrid>
+        <w:gridCol w:w="4320"/>
+        <w:gridCol w:w="4320"/>
+      </w:tblGrid>
+      <w:tr>
+        <w:tc>
+          <w:tcPr>
+            <w:tcW w:type="dxa" w:w="4320"/>
+            <w:shd w:fill="D9E2F3"/>
+          </w:tcPr>
+          <w:p>
+            <w:r>
+              <w:rPr>
+                <w:b/>
+                <w:sz w:val="19"/>
+              </w:rPr>
+            </w:r>
+            <w:r>
+              <w:rPr>
+                <w:b/>
+                <w:sz w:val="19"/>
+              </w:rPr>
+              <w:t>项</w:t>
+            </w:r>
+          </w:p>
+        </w:tc>
+        <w:tc>
+          <w:tcPr>
+            <w:tcW w:type="dxa" w:w="4320"/>
+            <w:shd w:fill="D9E2F3"/>
+          </w:tcPr>
+          <w:p>
+            <w:r>
+              <w:rPr>
+                <w:b/>
+                <w:sz w:val="19"/>
+              </w:rPr>
+            </w:r>
+            <w:r>
+              <w:rPr>
+                <w:b/>
+                <w:sz w:val="19"/>
+              </w:rPr>
+              <w:t>值</w:t>
             </w:r>
           </w:p>
         </w:tc>
@@ -267,7 +326,7 @@
               <w:rPr>
                 <w:sz w:val="19"/>
               </w:rPr>
-              <w:t>通用参数</w:t>
+              <w:t>操作系统</w:t>
             </w:r>
           </w:p>
         </w:tc>
@@ -283,10 +342,9 @@
             </w:r>
             <w:r>
               <w:rPr>
-                <w:rFonts w:ascii="Consolas" w:hAnsi="Consolas" w:eastAsia="宋体"/>
-                <w:sz w:val="19"/>
-              </w:rPr>
-              <w:t>--chunked-prefill-size 2048 --max-prefill-tokens 2048 --max-running-requests 32 --context-length 16384 --mem-fraction-static 0.85</w:t>
+                <w:sz w:val="19"/>
+              </w:rPr>
+              <w:t>KeyarchOS 5.10（浪潮 KOS）</w:t>
             </w:r>
           </w:p>
         </w:tc>
@@ -306,7 +364,7 @@
               <w:rPr>
                 <w:sz w:val="19"/>
               </w:rPr>
-              <w:t>HiCache 组（L2）</w:t>
+              <w:t>运行环境</w:t>
             </w:r>
           </w:p>
         </w:tc>
@@ -324,20 +382,7 @@
               <w:rPr>
                 <w:sz w:val="19"/>
               </w:rPr>
-              <w:t xml:space="preserve">追加 </w:t>
-            </w:r>
-            <w:r>
-              <w:rPr>
-                <w:rFonts w:ascii="Consolas" w:hAnsi="Consolas" w:eastAsia="宋体"/>
-                <w:sz w:val="19"/>
-              </w:rPr>
-              <w:t>--enable-hierarchical-cache --hicache-mem-layout layer_first --hicache-io-backend kernel --hicache-ratio 2</w:t>
-            </w:r>
-            <w:r>
-              <w:rPr>
-                <w:sz w:val="19"/>
-              </w:rPr>
-              <w:t>（host 池 = 2×131k = 262k tokens，1024 blocks × 996864 B）</w:t>
+              <w:t>Docker 24.0.9，Python 3.11.6，conda env kt-sglang（SGLang dongshijiang fork，kt-v0.6.3 分支 @ 9e0a481a4）</w:t>
             </w:r>
           </w:p>
         </w:tc>
@@ -357,7 +402,7 @@
               <w:rPr>
                 <w:sz w:val="19"/>
               </w:rPr>
-              <w:t>base 组</w:t>
+              <w:t>环境变量</w:t>
             </w:r>
           </w:p>
         </w:tc>
@@ -375,7 +420,72 @@
               <w:rPr>
                 <w:sz w:val="19"/>
               </w:rPr>
-              <w:t>同配置去掉 HiCache 参数（对照组）</w:t>
+              <w:t>SGLANG_DSV4_MODE=2604 / SUBMODE=2604B、SGLANG_SWA_SHADOW_SLOT=1</w:t>
+            </w:r>
+          </w:p>
+        </w:tc>
+      </w:tr>
+    </w:tbl>
+    <w:p/>
+    <w:p>
+      <w:r>
+        <w:rPr>
+          <w:b/>
+        </w:rPr>
+        <w:t>推理配置</w:t>
+      </w:r>
+    </w:p>
+    <w:tbl>
+      <w:tblPr>
+        <w:tblStyle w:val="TableGrid"/>
+        <w:tblW w:type="auto" w:w="0"/>
+        <w:jc w:val="center"/>
+        <w:tblLook w:firstColumn="1" w:firstRow="1" w:lastColumn="0" w:lastRow="0" w:noHBand="0" w:noVBand="1" w:val="04A0"/>
+      </w:tblPr>
+      <w:tblGrid>
+        <w:gridCol w:w="4320"/>
+        <w:gridCol w:w="4320"/>
+      </w:tblGrid>
+      <w:tr>
+        <w:tc>
+          <w:tcPr>
+            <w:tcW w:type="dxa" w:w="4320"/>
+            <w:shd w:fill="D9E2F3"/>
+          </w:tcPr>
+          <w:p>
+            <w:r>
+              <w:rPr>
+                <w:b/>
+                <w:sz w:val="19"/>
+              </w:rPr>
+            </w:r>
+            <w:r>
+              <w:rPr>
+                <w:b/>
+                <w:sz w:val="19"/>
+              </w:rPr>
+              <w:t>项</w:t>
+            </w:r>
+          </w:p>
+        </w:tc>
+        <w:tc>
+          <w:tcPr>
+            <w:tcW w:type="dxa" w:w="4320"/>
+            <w:shd w:fill="D9E2F3"/>
+          </w:tcPr>
+          <w:p>
+            <w:r>
+              <w:rPr>
+                <w:b/>
+                <w:sz w:val="19"/>
+              </w:rPr>
+            </w:r>
+            <w:r>
+              <w:rPr>
+                <w:b/>
+                <w:sz w:val="19"/>
+              </w:rPr>
+              <w:t>值</w:t>
             </w:r>
           </w:p>
         </w:tc>
@@ -395,7 +505,7 @@
               <w:rPr>
                 <w:sz w:val="19"/>
               </w:rPr>
-              <w:t>运行环境</w:t>
+              <w:t>模型</w:t>
             </w:r>
           </w:p>
         </w:tc>
@@ -413,13 +523,251 @@
               <w:rPr>
                 <w:sz w:val="19"/>
               </w:rPr>
-              <w:t>SGLANG_DSV4_MODE=2604 / SUBMODE=2604B、SGLANG_SWA_SHADOW_SLOT=1，conda env kt-sglang</w:t>
+              <w:t>DeepSeek-V4-Flash（43 层混合架构，sliding_window=128，MLA kv_heads=1 / head_dim=512）</w:t>
+            </w:r>
+          </w:p>
+        </w:tc>
+      </w:tr>
+      <w:tr>
+        <w:tc>
+          <w:tcPr>
+            <w:tcW w:type="dxa" w:w="4320"/>
+          </w:tcPr>
+          <w:p>
+            <w:r>
+              <w:rPr>
+                <w:sz w:val="19"/>
+              </w:rPr>
+            </w:r>
+            <w:r>
+              <w:rPr>
+                <w:sz w:val="19"/>
+              </w:rPr>
+              <w:t>量化/加速</w:t>
+            </w:r>
+          </w:p>
+        </w:tc>
+        <w:tc>
+          <w:tcPr>
+            <w:tcW w:type="dxa" w:w="4320"/>
+          </w:tcPr>
+          <w:p>
+            <w:r>
+              <w:rPr>
+                <w:sz w:val="19"/>
+              </w:rPr>
+            </w:r>
+            <w:r>
+              <w:rPr>
+                <w:sz w:val="19"/>
+              </w:rPr>
+              <w:t>KT MXFP4，</w:t>
+            </w:r>
+            <w:r>
+              <w:rPr>
+                <w:rFonts w:ascii="Consolas" w:hAnsi="Consolas" w:eastAsia="宋体"/>
+                <w:sz w:val="19"/>
+              </w:rPr>
+              <w:t>--kt-num-gpu-experts 30 --kt-cpuinfer 128 --kt-threadpool-count 4 --kt-enable-dynamic-expert-update</w:t>
+            </w:r>
+          </w:p>
+        </w:tc>
+      </w:tr>
+      <w:tr>
+        <w:tc>
+          <w:tcPr>
+            <w:tcW w:type="dxa" w:w="4320"/>
+          </w:tcPr>
+          <w:p>
+            <w:r>
+              <w:rPr>
+                <w:sz w:val="19"/>
+              </w:rPr>
+            </w:r>
+            <w:r>
+              <w:rPr>
+                <w:sz w:val="19"/>
+              </w:rPr>
+              <w:t>KV 池（L1）</w:t>
+            </w:r>
+          </w:p>
+        </w:tc>
+        <w:tc>
+          <w:tcPr>
+            <w:tcW w:type="dxa" w:w="4320"/>
+          </w:tcPr>
+          <w:p>
+            <w:r>
+              <w:rPr>
+                <w:sz w:val="19"/>
+              </w:rPr>
+            </w:r>
+            <w:r>
+              <w:rPr>
+                <w:rFonts w:ascii="Consolas" w:hAnsi="Consolas" w:eastAsia="宋体"/>
+                <w:sz w:val="19"/>
+              </w:rPr>
+              <w:t>--max-total-tokens 131072 --swa-full-tokens-ratio 1.0</w:t>
+            </w:r>
+            <w:r>
+              <w:rPr>
+                <w:sz w:val="19"/>
+              </w:rPr>
+              <w:t>（full/swa 各 131k）</w:t>
+            </w:r>
+          </w:p>
+        </w:tc>
+      </w:tr>
+      <w:tr>
+        <w:tc>
+          <w:tcPr>
+            <w:tcW w:type="dxa" w:w="4320"/>
+          </w:tcPr>
+          <w:p>
+            <w:r>
+              <w:rPr>
+                <w:sz w:val="19"/>
+              </w:rPr>
+            </w:r>
+            <w:r>
+              <w:rPr>
+                <w:sz w:val="19"/>
+              </w:rPr>
+              <w:t>通用参数</w:t>
+            </w:r>
+          </w:p>
+        </w:tc>
+        <w:tc>
+          <w:tcPr>
+            <w:tcW w:type="dxa" w:w="4320"/>
+          </w:tcPr>
+          <w:p>
+            <w:r>
+              <w:rPr>
+                <w:sz w:val="19"/>
+              </w:rPr>
+            </w:r>
+            <w:r>
+              <w:rPr>
+                <w:rFonts w:ascii="Consolas" w:hAnsi="Consolas" w:eastAsia="宋体"/>
+                <w:sz w:val="19"/>
+              </w:rPr>
+              <w:t>--chunked-prefill-size 2048 --max-prefill-tokens 2048 --max-running-requests 32 --context-length 16384 --mem-fraction-static 0.85 --attention-backend flashinfer</w:t>
+            </w:r>
+          </w:p>
+        </w:tc>
+      </w:tr>
+      <w:tr>
+        <w:tc>
+          <w:tcPr>
+            <w:tcW w:type="dxa" w:w="4320"/>
+          </w:tcPr>
+          <w:p>
+            <w:r>
+              <w:rPr>
+                <w:sz w:val="19"/>
+              </w:rPr>
+            </w:r>
+            <w:r>
+              <w:rPr>
+                <w:sz w:val="19"/>
+              </w:rPr>
+              <w:t>HiCache 组（L2）</w:t>
+            </w:r>
+          </w:p>
+        </w:tc>
+        <w:tc>
+          <w:tcPr>
+            <w:tcW w:type="dxa" w:w="4320"/>
+          </w:tcPr>
+          <w:p>
+            <w:r>
+              <w:rPr>
+                <w:sz w:val="19"/>
+              </w:rPr>
+            </w:r>
+            <w:r>
+              <w:rPr>
+                <w:sz w:val="19"/>
+              </w:rPr>
+              <w:t xml:space="preserve">追加 </w:t>
+            </w:r>
+            <w:r>
+              <w:rPr>
+                <w:rFonts w:ascii="Consolas" w:hAnsi="Consolas" w:eastAsia="宋体"/>
+                <w:sz w:val="19"/>
+              </w:rPr>
+              <w:t>--enable-hierarchical-cache --hicache-mem-layout layer_first --hicache-io-backend kernel --hicache-ratio 2</w:t>
+            </w:r>
+            <w:r>
+              <w:rPr>
+                <w:sz w:val="19"/>
+              </w:rPr>
+              <w:t>（host 池 = 2×131k = 262k tokens，1024 blocks × 996864 B ≈ 1.0GB）</w:t>
+            </w:r>
+          </w:p>
+        </w:tc>
+      </w:tr>
+      <w:tr>
+        <w:tc>
+          <w:tcPr>
+            <w:tcW w:type="dxa" w:w="4320"/>
+          </w:tcPr>
+          <w:p>
+            <w:r>
+              <w:rPr>
+                <w:sz w:val="19"/>
+              </w:rPr>
+            </w:r>
+            <w:r>
+              <w:rPr>
+                <w:sz w:val="19"/>
+              </w:rPr>
+              <w:t>base 组</w:t>
+            </w:r>
+          </w:p>
+        </w:tc>
+        <w:tc>
+          <w:tcPr>
+            <w:tcW w:type="dxa" w:w="4320"/>
+          </w:tcPr>
+          <w:p>
+            <w:r>
+              <w:rPr>
+                <w:sz w:val="19"/>
+              </w:rPr>
+            </w:r>
+            <w:r>
+              <w:rPr>
+                <w:sz w:val="19"/>
+              </w:rPr>
+              <w:t>同配置去掉 HiCache 参数（对照组）</w:t>
             </w:r>
           </w:p>
         </w:tc>
       </w:tr>
     </w:tbl>
     <w:p/>
+    <w:p>
+      <w:r>
+        <w:rPr>
+          <w:b/>
+        </w:rPr>
+        <w:t>最小内存要求</w:t>
+      </w:r>
+      <w:r>
+        <w:t xml:space="preserve">：权重 149GB（mmap 常驻页缓存）+ 推理运行时 ≈75GB（激活、KV 索引、expert staging、框架开销）+ HiCache host 池 ≈1GB → </w:t>
+      </w:r>
+      <w:r>
+        <w:rPr>
+          <w:b/>
+        </w:rPr>
+        <w:t>最低 256GB，推荐 ≥512GB</w:t>
+      </w:r>
+      <w:r>
+        <w:t>（权重页缓存全驻留 + 多 NUMA 交错带宽收益；实测整机已用 224GB / 页缓存 187GB）。</w:t>
+      </w:r>
+    </w:p>
     <w:p>
       <w:pPr>
         <w:pStyle w:val="Heading3"/>
@@ -2043,6 +2391,62 @@
               <w:rPr>
                 <w:sz w:val="19"/>
               </w:rPr>
+              <w:t>解码 TPOT（50 token 生成）</w:t>
+            </w:r>
+          </w:p>
+        </w:tc>
+        <w:tc>
+          <w:tcPr>
+            <w:tcW w:type="dxa" w:w="2880"/>
+          </w:tcPr>
+          <w:p>
+            <w:r>
+              <w:rPr>
+                <w:sz w:val="19"/>
+              </w:rPr>
+            </w:r>
+            <w:r>
+              <w:rPr>
+                <w:sz w:val="19"/>
+              </w:rPr>
+              <w:t>44.1ms</w:t>
+            </w:r>
+          </w:p>
+        </w:tc>
+        <w:tc>
+          <w:tcPr>
+            <w:tcW w:type="dxa" w:w="2880"/>
+          </w:tcPr>
+          <w:p>
+            <w:r>
+              <w:rPr>
+                <w:sz w:val="19"/>
+              </w:rPr>
+            </w:r>
+            <w:r>
+              <w:rPr>
+                <w:sz w:val="19"/>
+              </w:rPr>
+              <w:t>45.0ms（回迁轮解码速度与全量 prefill 一致）</w:t>
+            </w:r>
+          </w:p>
+        </w:tc>
+      </w:tr>
+      <w:tr>
+        <w:tc>
+          <w:tcPr>
+            <w:tcW w:type="dxa" w:w="2880"/>
+          </w:tcPr>
+          <w:p>
+            <w:r>
+              <w:rPr>
+                <w:sz w:val="19"/>
+              </w:rPr>
+            </w:r>
+            <w:r>
+              <w:rPr>
+                <w:sz w:val="19"/>
+              </w:rPr>
               <w:t>similarity</w:t>
             </w:r>
           </w:p>
@@ -2977,6 +3381,1633 @@
       </w:tr>
     </w:tbl>
     <w:p/>
+    <w:p>
+      <w:pPr>
+        <w:pStyle w:val="Heading3"/>
+      </w:pPr>
+      <w:r>
+        <w:t>2.6 基线与 HiCache 组性能对比总表</w:t>
+      </w:r>
+    </w:p>
+    <w:p>
+      <w:r>
+        <w:t>TTFT（cold=首轮 mean / warm=第 2-8 轮 mean）：</w:t>
+      </w:r>
+    </w:p>
+    <w:tbl>
+      <w:tblPr>
+        <w:tblStyle w:val="TableGrid"/>
+        <w:tblW w:type="auto" w:w="0"/>
+        <w:jc w:val="center"/>
+        <w:tblLook w:firstColumn="1" w:firstRow="1" w:lastColumn="0" w:lastRow="0" w:noHBand="0" w:noVBand="1" w:val="04A0"/>
+      </w:tblPr>
+      <w:tblGrid>
+        <w:gridCol w:w="1440"/>
+        <w:gridCol w:w="1440"/>
+        <w:gridCol w:w="1440"/>
+        <w:gridCol w:w="1440"/>
+        <w:gridCol w:w="1440"/>
+        <w:gridCol w:w="1440"/>
+      </w:tblGrid>
+      <w:tr>
+        <w:tc>
+          <w:tcPr>
+            <w:tcW w:type="dxa" w:w="1440"/>
+            <w:shd w:fill="D9E2F3"/>
+          </w:tcPr>
+          <w:p>
+            <w:r>
+              <w:rPr>
+                <w:b/>
+                <w:sz w:val="19"/>
+              </w:rPr>
+            </w:r>
+            <w:r>
+              <w:rPr>
+                <w:b/>
+                <w:sz w:val="19"/>
+              </w:rPr>
+              <w:t>n</w:t>
+            </w:r>
+          </w:p>
+        </w:tc>
+        <w:tc>
+          <w:tcPr>
+            <w:tcW w:type="dxa" w:w="1440"/>
+            <w:shd w:fill="D9E2F3"/>
+          </w:tcPr>
+          <w:p>
+            <w:r>
+              <w:rPr>
+                <w:b/>
+                <w:sz w:val="19"/>
+              </w:rPr>
+            </w:r>
+            <w:r>
+              <w:rPr>
+                <w:b/>
+                <w:sz w:val="19"/>
+              </w:rPr>
+              <w:t>base cold</w:t>
+            </w:r>
+          </w:p>
+        </w:tc>
+        <w:tc>
+          <w:tcPr>
+            <w:tcW w:type="dxa" w:w="1440"/>
+            <w:shd w:fill="D9E2F3"/>
+          </w:tcPr>
+          <w:p>
+            <w:r>
+              <w:rPr>
+                <w:b/>
+                <w:sz w:val="19"/>
+              </w:rPr>
+            </w:r>
+            <w:r>
+              <w:rPr>
+                <w:b/>
+                <w:sz w:val="19"/>
+              </w:rPr>
+              <w:t>HiCache cold</w:t>
+            </w:r>
+          </w:p>
+        </w:tc>
+        <w:tc>
+          <w:tcPr>
+            <w:tcW w:type="dxa" w:w="1440"/>
+            <w:shd w:fill="D9E2F3"/>
+          </w:tcPr>
+          <w:p>
+            <w:r>
+              <w:rPr>
+                <w:b/>
+                <w:sz w:val="19"/>
+              </w:rPr>
+            </w:r>
+            <w:r>
+              <w:rPr>
+                <w:b/>
+                <w:sz w:val="19"/>
+              </w:rPr>
+              <w:t>base warm</w:t>
+            </w:r>
+          </w:p>
+        </w:tc>
+        <w:tc>
+          <w:tcPr>
+            <w:tcW w:type="dxa" w:w="1440"/>
+            <w:shd w:fill="D9E2F3"/>
+          </w:tcPr>
+          <w:p>
+            <w:r>
+              <w:rPr>
+                <w:b/>
+                <w:sz w:val="19"/>
+              </w:rPr>
+            </w:r>
+            <w:r>
+              <w:rPr>
+                <w:b/>
+                <w:sz w:val="19"/>
+              </w:rPr>
+              <w:t>HiCache warm</w:t>
+            </w:r>
+          </w:p>
+        </w:tc>
+        <w:tc>
+          <w:tcPr>
+            <w:tcW w:type="dxa" w:w="1440"/>
+            <w:shd w:fill="D9E2F3"/>
+          </w:tcPr>
+          <w:p>
+            <w:r>
+              <w:rPr>
+                <w:b/>
+                <w:sz w:val="19"/>
+              </w:rPr>
+            </w:r>
+            <w:r>
+              <w:rPr>
+                <w:b/>
+                <w:sz w:val="19"/>
+              </w:rPr>
+              <w:t>warm 收益</w:t>
+            </w:r>
+          </w:p>
+        </w:tc>
+      </w:tr>
+      <w:tr>
+        <w:tc>
+          <w:tcPr>
+            <w:tcW w:type="dxa" w:w="1440"/>
+          </w:tcPr>
+          <w:p>
+            <w:r>
+              <w:rPr>
+                <w:sz w:val="19"/>
+              </w:rPr>
+            </w:r>
+            <w:r>
+              <w:rPr>
+                <w:sz w:val="19"/>
+              </w:rPr>
+              <w:t>1</w:t>
+            </w:r>
+          </w:p>
+        </w:tc>
+        <w:tc>
+          <w:tcPr>
+            <w:tcW w:type="dxa" w:w="1440"/>
+          </w:tcPr>
+          <w:p>
+            <w:r>
+              <w:rPr>
+                <w:sz w:val="19"/>
+              </w:rPr>
+            </w:r>
+            <w:r>
+              <w:rPr>
+                <w:sz w:val="19"/>
+              </w:rPr>
+              <w:t>18.6s</w:t>
+            </w:r>
+          </w:p>
+        </w:tc>
+        <w:tc>
+          <w:tcPr>
+            <w:tcW w:type="dxa" w:w="1440"/>
+          </w:tcPr>
+          <w:p>
+            <w:r>
+              <w:rPr>
+                <w:sz w:val="19"/>
+              </w:rPr>
+            </w:r>
+            <w:r>
+              <w:rPr>
+                <w:sz w:val="19"/>
+              </w:rPr>
+              <w:t>18.6s</w:t>
+            </w:r>
+          </w:p>
+        </w:tc>
+        <w:tc>
+          <w:tcPr>
+            <w:tcW w:type="dxa" w:w="1440"/>
+          </w:tcPr>
+          <w:p>
+            <w:r>
+              <w:rPr>
+                <w:sz w:val="19"/>
+              </w:rPr>
+            </w:r>
+            <w:r>
+              <w:rPr>
+                <w:sz w:val="19"/>
+              </w:rPr>
+              <w:t>4.4s</w:t>
+            </w:r>
+          </w:p>
+        </w:tc>
+        <w:tc>
+          <w:tcPr>
+            <w:tcW w:type="dxa" w:w="1440"/>
+          </w:tcPr>
+          <w:p>
+            <w:r>
+              <w:rPr>
+                <w:sz w:val="19"/>
+              </w:rPr>
+            </w:r>
+            <w:r>
+              <w:rPr>
+                <w:sz w:val="19"/>
+              </w:rPr>
+              <w:t>3.9s</w:t>
+            </w:r>
+          </w:p>
+        </w:tc>
+        <w:tc>
+          <w:tcPr>
+            <w:tcW w:type="dxa" w:w="1440"/>
+          </w:tcPr>
+          <w:p>
+            <w:r>
+              <w:rPr>
+                <w:sz w:val="19"/>
+              </w:rPr>
+            </w:r>
+            <w:r>
+              <w:rPr>
+                <w:sz w:val="19"/>
+              </w:rPr>
+              <w:t>1.1×</w:t>
+            </w:r>
+          </w:p>
+        </w:tc>
+      </w:tr>
+      <w:tr>
+        <w:tc>
+          <w:tcPr>
+            <w:tcW w:type="dxa" w:w="1440"/>
+          </w:tcPr>
+          <w:p>
+            <w:r>
+              <w:rPr>
+                <w:sz w:val="19"/>
+              </w:rPr>
+            </w:r>
+            <w:r>
+              <w:rPr>
+                <w:sz w:val="19"/>
+              </w:rPr>
+              <w:t>4</w:t>
+            </w:r>
+          </w:p>
+        </w:tc>
+        <w:tc>
+          <w:tcPr>
+            <w:tcW w:type="dxa" w:w="1440"/>
+          </w:tcPr>
+          <w:p>
+            <w:r>
+              <w:rPr>
+                <w:sz w:val="19"/>
+              </w:rPr>
+            </w:r>
+            <w:r>
+              <w:rPr>
+                <w:sz w:val="19"/>
+              </w:rPr>
+              <w:t>50.6s</w:t>
+            </w:r>
+          </w:p>
+        </w:tc>
+        <w:tc>
+          <w:tcPr>
+            <w:tcW w:type="dxa" w:w="1440"/>
+          </w:tcPr>
+          <w:p>
+            <w:r>
+              <w:rPr>
+                <w:sz w:val="19"/>
+              </w:rPr>
+            </w:r>
+            <w:r>
+              <w:rPr>
+                <w:sz w:val="19"/>
+              </w:rPr>
+              <w:t>51.1s</w:t>
+            </w:r>
+          </w:p>
+        </w:tc>
+        <w:tc>
+          <w:tcPr>
+            <w:tcW w:type="dxa" w:w="1440"/>
+          </w:tcPr>
+          <w:p>
+            <w:r>
+              <w:rPr>
+                <w:sz w:val="19"/>
+              </w:rPr>
+            </w:r>
+            <w:r>
+              <w:rPr>
+                <w:sz w:val="19"/>
+              </w:rPr>
+              <w:t>8.4s</w:t>
+            </w:r>
+          </w:p>
+        </w:tc>
+        <w:tc>
+          <w:tcPr>
+            <w:tcW w:type="dxa" w:w="1440"/>
+          </w:tcPr>
+          <w:p>
+            <w:r>
+              <w:rPr>
+                <w:sz w:val="19"/>
+              </w:rPr>
+            </w:r>
+            <w:r>
+              <w:rPr>
+                <w:sz w:val="19"/>
+              </w:rPr>
+              <w:t>9.6s</w:t>
+            </w:r>
+          </w:p>
+        </w:tc>
+        <w:tc>
+          <w:tcPr>
+            <w:tcW w:type="dxa" w:w="1440"/>
+          </w:tcPr>
+          <w:p>
+            <w:r>
+              <w:rPr>
+                <w:sz w:val="19"/>
+              </w:rPr>
+            </w:r>
+            <w:r>
+              <w:rPr>
+                <w:sz w:val="19"/>
+              </w:rPr>
+              <w:t>0.88×（写回开销）</w:t>
+            </w:r>
+          </w:p>
+        </w:tc>
+      </w:tr>
+      <w:tr>
+        <w:tc>
+          <w:tcPr>
+            <w:tcW w:type="dxa" w:w="1440"/>
+          </w:tcPr>
+          <w:p>
+            <w:r>
+              <w:rPr>
+                <w:sz w:val="19"/>
+              </w:rPr>
+            </w:r>
+            <w:r>
+              <w:rPr>
+                <w:sz w:val="19"/>
+              </w:rPr>
+              <w:t>8</w:t>
+            </w:r>
+          </w:p>
+        </w:tc>
+        <w:tc>
+          <w:tcPr>
+            <w:tcW w:type="dxa" w:w="1440"/>
+          </w:tcPr>
+          <w:p>
+            <w:r>
+              <w:rPr>
+                <w:sz w:val="19"/>
+              </w:rPr>
+            </w:r>
+            <w:r>
+              <w:rPr>
+                <w:sz w:val="19"/>
+              </w:rPr>
+              <w:t>87.9s</w:t>
+            </w:r>
+          </w:p>
+        </w:tc>
+        <w:tc>
+          <w:tcPr>
+            <w:tcW w:type="dxa" w:w="1440"/>
+          </w:tcPr>
+          <w:p>
+            <w:r>
+              <w:rPr>
+                <w:sz w:val="19"/>
+              </w:rPr>
+            </w:r>
+            <w:r>
+              <w:rPr>
+                <w:sz w:val="19"/>
+              </w:rPr>
+              <w:t>88.2s</w:t>
+            </w:r>
+          </w:p>
+        </w:tc>
+        <w:tc>
+          <w:tcPr>
+            <w:tcW w:type="dxa" w:w="1440"/>
+          </w:tcPr>
+          <w:p>
+            <w:r>
+              <w:rPr>
+                <w:sz w:val="19"/>
+              </w:rPr>
+            </w:r>
+            <w:r>
+              <w:rPr>
+                <w:sz w:val="19"/>
+              </w:rPr>
+              <w:t>13.0s</w:t>
+            </w:r>
+          </w:p>
+        </w:tc>
+        <w:tc>
+          <w:tcPr>
+            <w:tcW w:type="dxa" w:w="1440"/>
+          </w:tcPr>
+          <w:p>
+            <w:r>
+              <w:rPr>
+                <w:sz w:val="19"/>
+              </w:rPr>
+            </w:r>
+            <w:r>
+              <w:rPr>
+                <w:sz w:val="19"/>
+              </w:rPr>
+              <w:t>16.6s</w:t>
+            </w:r>
+          </w:p>
+        </w:tc>
+        <w:tc>
+          <w:tcPr>
+            <w:tcW w:type="dxa" w:w="1440"/>
+          </w:tcPr>
+          <w:p>
+            <w:r>
+              <w:rPr>
+                <w:sz w:val="19"/>
+              </w:rPr>
+            </w:r>
+            <w:r>
+              <w:rPr>
+                <w:sz w:val="19"/>
+              </w:rPr>
+              <w:t>0.78×（写回开销）</w:t>
+            </w:r>
+          </w:p>
+        </w:tc>
+      </w:tr>
+      <w:tr>
+        <w:tc>
+          <w:tcPr>
+            <w:tcW w:type="dxa" w:w="1440"/>
+          </w:tcPr>
+          <w:p>
+            <w:r>
+              <w:rPr>
+                <w:sz w:val="19"/>
+              </w:rPr>
+            </w:r>
+            <w:r>
+              <w:rPr>
+                <w:sz w:val="19"/>
+              </w:rPr>
+              <w:t>16</w:t>
+            </w:r>
+          </w:p>
+        </w:tc>
+        <w:tc>
+          <w:tcPr>
+            <w:tcW w:type="dxa" w:w="1440"/>
+          </w:tcPr>
+          <w:p>
+            <w:r>
+              <w:rPr>
+                <w:sz w:val="19"/>
+              </w:rPr>
+            </w:r>
+            <w:r>
+              <w:rPr>
+                <w:sz w:val="19"/>
+              </w:rPr>
+              <w:t>161.5s</w:t>
+            </w:r>
+          </w:p>
+        </w:tc>
+        <w:tc>
+          <w:tcPr>
+            <w:tcW w:type="dxa" w:w="1440"/>
+          </w:tcPr>
+          <w:p>
+            <w:r>
+              <w:rPr>
+                <w:sz w:val="19"/>
+              </w:rPr>
+            </w:r>
+            <w:r>
+              <w:rPr>
+                <w:sz w:val="19"/>
+              </w:rPr>
+              <w:t>162.0s</w:t>
+            </w:r>
+          </w:p>
+        </w:tc>
+        <w:tc>
+          <w:tcPr>
+            <w:tcW w:type="dxa" w:w="1440"/>
+          </w:tcPr>
+          <w:p>
+            <w:r>
+              <w:rPr>
+                <w:sz w:val="19"/>
+              </w:rPr>
+            </w:r>
+            <w:r>
+              <w:rPr>
+                <w:sz w:val="19"/>
+              </w:rPr>
+              <w:t>24.9s</w:t>
+            </w:r>
+          </w:p>
+        </w:tc>
+        <w:tc>
+          <w:tcPr>
+            <w:tcW w:type="dxa" w:w="1440"/>
+          </w:tcPr>
+          <w:p>
+            <w:r>
+              <w:rPr>
+                <w:sz w:val="19"/>
+              </w:rPr>
+            </w:r>
+            <w:r>
+              <w:rPr>
+                <w:sz w:val="19"/>
+              </w:rPr>
+              <w:t>25.7s</w:t>
+            </w:r>
+          </w:p>
+        </w:tc>
+        <w:tc>
+          <w:tcPr>
+            <w:tcW w:type="dxa" w:w="1440"/>
+          </w:tcPr>
+          <w:p>
+            <w:r>
+              <w:rPr>
+                <w:sz w:val="19"/>
+              </w:rPr>
+            </w:r>
+            <w:r>
+              <w:rPr>
+                <w:sz w:val="19"/>
+              </w:rPr>
+              <w:t>0.97×</w:t>
+            </w:r>
+          </w:p>
+        </w:tc>
+      </w:tr>
+      <w:tr>
+        <w:tc>
+          <w:tcPr>
+            <w:tcW w:type="dxa" w:w="1440"/>
+          </w:tcPr>
+          <w:p>
+            <w:r>
+              <w:rPr>
+                <w:sz w:val="19"/>
+              </w:rPr>
+            </w:r>
+            <w:r>
+              <w:rPr>
+                <w:sz w:val="19"/>
+              </w:rPr>
+              <w:t>32</w:t>
+            </w:r>
+          </w:p>
+        </w:tc>
+        <w:tc>
+          <w:tcPr>
+            <w:tcW w:type="dxa" w:w="1440"/>
+          </w:tcPr>
+          <w:p>
+            <w:r>
+              <w:rPr>
+                <w:sz w:val="19"/>
+              </w:rPr>
+            </w:r>
+            <w:r>
+              <w:rPr>
+                <w:sz w:val="19"/>
+              </w:rPr>
+              <w:t>308.7s</w:t>
+            </w:r>
+          </w:p>
+        </w:tc>
+        <w:tc>
+          <w:tcPr>
+            <w:tcW w:type="dxa" w:w="1440"/>
+          </w:tcPr>
+          <w:p>
+            <w:r>
+              <w:rPr>
+                <w:sz w:val="19"/>
+              </w:rPr>
+            </w:r>
+            <w:r>
+              <w:rPr>
+                <w:sz w:val="19"/>
+              </w:rPr>
+              <w:t>309.3s</w:t>
+            </w:r>
+          </w:p>
+        </w:tc>
+        <w:tc>
+          <w:tcPr>
+            <w:tcW w:type="dxa" w:w="1440"/>
+          </w:tcPr>
+          <w:p>
+            <w:r>
+              <w:rPr>
+                <w:sz w:val="19"/>
+              </w:rPr>
+            </w:r>
+            <w:r>
+              <w:rPr>
+                <w:sz w:val="19"/>
+              </w:rPr>
+              <w:t>436.1s</w:t>
+            </w:r>
+          </w:p>
+        </w:tc>
+        <w:tc>
+          <w:tcPr>
+            <w:tcW w:type="dxa" w:w="1440"/>
+          </w:tcPr>
+          <w:p>
+            <w:r>
+              <w:rPr>
+                <w:sz w:val="19"/>
+              </w:rPr>
+            </w:r>
+            <w:r>
+              <w:rPr>
+                <w:sz w:val="19"/>
+              </w:rPr>
+              <w:t>68.6s</w:t>
+            </w:r>
+          </w:p>
+        </w:tc>
+        <w:tc>
+          <w:tcPr>
+            <w:tcW w:type="dxa" w:w="1440"/>
+          </w:tcPr>
+          <w:p>
+            <w:r>
+              <w:rPr>
+                <w:sz w:val="19"/>
+              </w:rPr>
+            </w:r>
+            <w:r>
+              <w:rPr>
+                <w:b/>
+                <w:sz w:val="19"/>
+              </w:rPr>
+              <w:t>6.4×</w:t>
+            </w:r>
+          </w:p>
+        </w:tc>
+      </w:tr>
+    </w:tbl>
+    <w:p/>
+    <w:p>
+      <w:r>
+        <w:t>解码 TPOT / TPS（warm 轮 mean；TPS=1000/TPOT 为单会话解码速度）：</w:t>
+      </w:r>
+    </w:p>
+    <w:tbl>
+      <w:tblPr>
+        <w:tblStyle w:val="TableGrid"/>
+        <w:tblW w:type="auto" w:w="0"/>
+        <w:jc w:val="center"/>
+        <w:tblLook w:firstColumn="1" w:firstRow="1" w:lastColumn="0" w:lastRow="0" w:noHBand="0" w:noVBand="1" w:val="04A0"/>
+      </w:tblPr>
+      <w:tblGrid>
+        <w:gridCol w:w="1440"/>
+        <w:gridCol w:w="1440"/>
+        <w:gridCol w:w="1440"/>
+        <w:gridCol w:w="1440"/>
+        <w:gridCol w:w="1440"/>
+        <w:gridCol w:w="1440"/>
+      </w:tblGrid>
+      <w:tr>
+        <w:tc>
+          <w:tcPr>
+            <w:tcW w:type="dxa" w:w="1440"/>
+            <w:shd w:fill="D9E2F3"/>
+          </w:tcPr>
+          <w:p>
+            <w:r>
+              <w:rPr>
+                <w:b/>
+                <w:sz w:val="19"/>
+              </w:rPr>
+            </w:r>
+            <w:r>
+              <w:rPr>
+                <w:b/>
+                <w:sz w:val="19"/>
+              </w:rPr>
+              <w:t>n</w:t>
+            </w:r>
+          </w:p>
+        </w:tc>
+        <w:tc>
+          <w:tcPr>
+            <w:tcW w:type="dxa" w:w="1440"/>
+            <w:shd w:fill="D9E2F3"/>
+          </w:tcPr>
+          <w:p>
+            <w:r>
+              <w:rPr>
+                <w:b/>
+                <w:sz w:val="19"/>
+              </w:rPr>
+            </w:r>
+            <w:r>
+              <w:rPr>
+                <w:b/>
+                <w:sz w:val="19"/>
+              </w:rPr>
+              <w:t>base TPOT</w:t>
+            </w:r>
+          </w:p>
+        </w:tc>
+        <w:tc>
+          <w:tcPr>
+            <w:tcW w:type="dxa" w:w="1440"/>
+            <w:shd w:fill="D9E2F3"/>
+          </w:tcPr>
+          <w:p>
+            <w:r>
+              <w:rPr>
+                <w:b/>
+                <w:sz w:val="19"/>
+              </w:rPr>
+            </w:r>
+            <w:r>
+              <w:rPr>
+                <w:b/>
+                <w:sz w:val="19"/>
+              </w:rPr>
+              <w:t>HiCache TPOT</w:t>
+            </w:r>
+          </w:p>
+        </w:tc>
+        <w:tc>
+          <w:tcPr>
+            <w:tcW w:type="dxa" w:w="1440"/>
+            <w:shd w:fill="D9E2F3"/>
+          </w:tcPr>
+          <w:p>
+            <w:r>
+              <w:rPr>
+                <w:b/>
+                <w:sz w:val="19"/>
+              </w:rPr>
+            </w:r>
+            <w:r>
+              <w:rPr>
+                <w:b/>
+                <w:sz w:val="19"/>
+              </w:rPr>
+              <w:t>base TPS</w:t>
+            </w:r>
+          </w:p>
+        </w:tc>
+        <w:tc>
+          <w:tcPr>
+            <w:tcW w:type="dxa" w:w="1440"/>
+            <w:shd w:fill="D9E2F3"/>
+          </w:tcPr>
+          <w:p>
+            <w:r>
+              <w:rPr>
+                <w:b/>
+                <w:sz w:val="19"/>
+              </w:rPr>
+            </w:r>
+            <w:r>
+              <w:rPr>
+                <w:b/>
+                <w:sz w:val="19"/>
+              </w:rPr>
+              <w:t>HiCache TPS</w:t>
+            </w:r>
+          </w:p>
+        </w:tc>
+        <w:tc>
+          <w:tcPr>
+            <w:tcW w:type="dxa" w:w="1440"/>
+            <w:shd w:fill="D9E2F3"/>
+          </w:tcPr>
+          <w:p>
+            <w:r>
+              <w:rPr>
+                <w:b/>
+                <w:sz w:val="19"/>
+              </w:rPr>
+            </w:r>
+            <w:r>
+              <w:rPr>
+                <w:b/>
+                <w:sz w:val="19"/>
+              </w:rPr>
+              <w:t>HiCache 聚合 TPS（n×）</w:t>
+            </w:r>
+          </w:p>
+        </w:tc>
+      </w:tr>
+      <w:tr>
+        <w:tc>
+          <w:tcPr>
+            <w:tcW w:type="dxa" w:w="1440"/>
+          </w:tcPr>
+          <w:p>
+            <w:r>
+              <w:rPr>
+                <w:sz w:val="19"/>
+              </w:rPr>
+            </w:r>
+            <w:r>
+              <w:rPr>
+                <w:sz w:val="19"/>
+              </w:rPr>
+              <w:t>1</w:t>
+            </w:r>
+          </w:p>
+        </w:tc>
+        <w:tc>
+          <w:tcPr>
+            <w:tcW w:type="dxa" w:w="1440"/>
+          </w:tcPr>
+          <w:p>
+            <w:r>
+              <w:rPr>
+                <w:sz w:val="19"/>
+              </w:rPr>
+            </w:r>
+            <w:r>
+              <w:rPr>
+                <w:sz w:val="19"/>
+              </w:rPr>
+              <w:t>43.3ms</w:t>
+            </w:r>
+          </w:p>
+        </w:tc>
+        <w:tc>
+          <w:tcPr>
+            <w:tcW w:type="dxa" w:w="1440"/>
+          </w:tcPr>
+          <w:p>
+            <w:r>
+              <w:rPr>
+                <w:sz w:val="19"/>
+              </w:rPr>
+            </w:r>
+            <w:r>
+              <w:rPr>
+                <w:sz w:val="19"/>
+              </w:rPr>
+              <w:t>39.8ms</w:t>
+            </w:r>
+          </w:p>
+        </w:tc>
+        <w:tc>
+          <w:tcPr>
+            <w:tcW w:type="dxa" w:w="1440"/>
+          </w:tcPr>
+          <w:p>
+            <w:r>
+              <w:rPr>
+                <w:sz w:val="19"/>
+              </w:rPr>
+            </w:r>
+            <w:r>
+              <w:rPr>
+                <w:sz w:val="19"/>
+              </w:rPr>
+              <w:t>23.1 tok/s</w:t>
+            </w:r>
+          </w:p>
+        </w:tc>
+        <w:tc>
+          <w:tcPr>
+            <w:tcW w:type="dxa" w:w="1440"/>
+          </w:tcPr>
+          <w:p>
+            <w:r>
+              <w:rPr>
+                <w:sz w:val="19"/>
+              </w:rPr>
+            </w:r>
+            <w:r>
+              <w:rPr>
+                <w:sz w:val="19"/>
+              </w:rPr>
+              <w:t>25.1 tok/s</w:t>
+            </w:r>
+          </w:p>
+        </w:tc>
+        <w:tc>
+          <w:tcPr>
+            <w:tcW w:type="dxa" w:w="1440"/>
+          </w:tcPr>
+          <w:p>
+            <w:r>
+              <w:rPr>
+                <w:sz w:val="19"/>
+              </w:rPr>
+            </w:r>
+            <w:r>
+              <w:rPr>
+                <w:sz w:val="19"/>
+              </w:rPr>
+              <w:t>25.1</w:t>
+            </w:r>
+          </w:p>
+        </w:tc>
+      </w:tr>
+      <w:tr>
+        <w:tc>
+          <w:tcPr>
+            <w:tcW w:type="dxa" w:w="1440"/>
+          </w:tcPr>
+          <w:p>
+            <w:r>
+              <w:rPr>
+                <w:sz w:val="19"/>
+              </w:rPr>
+            </w:r>
+            <w:r>
+              <w:rPr>
+                <w:sz w:val="19"/>
+              </w:rPr>
+              <w:t>4</w:t>
+            </w:r>
+          </w:p>
+        </w:tc>
+        <w:tc>
+          <w:tcPr>
+            <w:tcW w:type="dxa" w:w="1440"/>
+          </w:tcPr>
+          <w:p>
+            <w:r>
+              <w:rPr>
+                <w:sz w:val="19"/>
+              </w:rPr>
+            </w:r>
+            <w:r>
+              <w:rPr>
+                <w:sz w:val="19"/>
+              </w:rPr>
+              <w:t>442.8ms</w:t>
+            </w:r>
+          </w:p>
+        </w:tc>
+        <w:tc>
+          <w:tcPr>
+            <w:tcW w:type="dxa" w:w="1440"/>
+          </w:tcPr>
+          <w:p>
+            <w:r>
+              <w:rPr>
+                <w:sz w:val="19"/>
+              </w:rPr>
+            </w:r>
+            <w:r>
+              <w:rPr>
+                <w:sz w:val="19"/>
+              </w:rPr>
+              <w:t>585.7ms</w:t>
+            </w:r>
+          </w:p>
+        </w:tc>
+        <w:tc>
+          <w:tcPr>
+            <w:tcW w:type="dxa" w:w="1440"/>
+          </w:tcPr>
+          <w:p>
+            <w:r>
+              <w:rPr>
+                <w:sz w:val="19"/>
+              </w:rPr>
+            </w:r>
+            <w:r>
+              <w:rPr>
+                <w:sz w:val="19"/>
+              </w:rPr>
+              <w:t>2.26</w:t>
+            </w:r>
+          </w:p>
+        </w:tc>
+        <w:tc>
+          <w:tcPr>
+            <w:tcW w:type="dxa" w:w="1440"/>
+          </w:tcPr>
+          <w:p>
+            <w:r>
+              <w:rPr>
+                <w:sz w:val="19"/>
+              </w:rPr>
+            </w:r>
+            <w:r>
+              <w:rPr>
+                <w:sz w:val="19"/>
+              </w:rPr>
+              <w:t>1.71</w:t>
+            </w:r>
+          </w:p>
+        </w:tc>
+        <w:tc>
+          <w:tcPr>
+            <w:tcW w:type="dxa" w:w="1440"/>
+          </w:tcPr>
+          <w:p>
+            <w:r>
+              <w:rPr>
+                <w:sz w:val="19"/>
+              </w:rPr>
+            </w:r>
+            <w:r>
+              <w:rPr>
+                <w:sz w:val="19"/>
+              </w:rPr>
+              <w:t>6.83</w:t>
+            </w:r>
+          </w:p>
+        </w:tc>
+      </w:tr>
+      <w:tr>
+        <w:tc>
+          <w:tcPr>
+            <w:tcW w:type="dxa" w:w="1440"/>
+          </w:tcPr>
+          <w:p>
+            <w:r>
+              <w:rPr>
+                <w:sz w:val="19"/>
+              </w:rPr>
+            </w:r>
+            <w:r>
+              <w:rPr>
+                <w:sz w:val="19"/>
+              </w:rPr>
+              <w:t>8</w:t>
+            </w:r>
+          </w:p>
+        </w:tc>
+        <w:tc>
+          <w:tcPr>
+            <w:tcW w:type="dxa" w:w="1440"/>
+          </w:tcPr>
+          <w:p>
+            <w:r>
+              <w:rPr>
+                <w:sz w:val="19"/>
+              </w:rPr>
+            </w:r>
+            <w:r>
+              <w:rPr>
+                <w:sz w:val="19"/>
+              </w:rPr>
+              <w:t>1041.8ms</w:t>
+            </w:r>
+          </w:p>
+        </w:tc>
+        <w:tc>
+          <w:tcPr>
+            <w:tcW w:type="dxa" w:w="1440"/>
+          </w:tcPr>
+          <w:p>
+            <w:r>
+              <w:rPr>
+                <w:sz w:val="19"/>
+              </w:rPr>
+            </w:r>
+            <w:r>
+              <w:rPr>
+                <w:sz w:val="19"/>
+              </w:rPr>
+              <w:t>1385.2ms</w:t>
+            </w:r>
+          </w:p>
+        </w:tc>
+        <w:tc>
+          <w:tcPr>
+            <w:tcW w:type="dxa" w:w="1440"/>
+          </w:tcPr>
+          <w:p>
+            <w:r>
+              <w:rPr>
+                <w:sz w:val="19"/>
+              </w:rPr>
+            </w:r>
+            <w:r>
+              <w:rPr>
+                <w:sz w:val="19"/>
+              </w:rPr>
+              <w:t>0.96</w:t>
+            </w:r>
+          </w:p>
+        </w:tc>
+        <w:tc>
+          <w:tcPr>
+            <w:tcW w:type="dxa" w:w="1440"/>
+          </w:tcPr>
+          <w:p>
+            <w:r>
+              <w:rPr>
+                <w:sz w:val="19"/>
+              </w:rPr>
+            </w:r>
+            <w:r>
+              <w:rPr>
+                <w:sz w:val="19"/>
+              </w:rPr>
+              <w:t>0.72</w:t>
+            </w:r>
+          </w:p>
+        </w:tc>
+        <w:tc>
+          <w:tcPr>
+            <w:tcW w:type="dxa" w:w="1440"/>
+          </w:tcPr>
+          <w:p>
+            <w:r>
+              <w:rPr>
+                <w:sz w:val="19"/>
+              </w:rPr>
+            </w:r>
+            <w:r>
+              <w:rPr>
+                <w:sz w:val="19"/>
+              </w:rPr>
+              <w:t>5.78</w:t>
+            </w:r>
+          </w:p>
+        </w:tc>
+      </w:tr>
+      <w:tr>
+        <w:tc>
+          <w:tcPr>
+            <w:tcW w:type="dxa" w:w="1440"/>
+          </w:tcPr>
+          <w:p>
+            <w:r>
+              <w:rPr>
+                <w:sz w:val="19"/>
+              </w:rPr>
+            </w:r>
+            <w:r>
+              <w:rPr>
+                <w:sz w:val="19"/>
+              </w:rPr>
+              <w:t>16</w:t>
+            </w:r>
+          </w:p>
+        </w:tc>
+        <w:tc>
+          <w:tcPr>
+            <w:tcW w:type="dxa" w:w="1440"/>
+          </w:tcPr>
+          <w:p>
+            <w:r>
+              <w:rPr>
+                <w:sz w:val="19"/>
+              </w:rPr>
+            </w:r>
+            <w:r>
+              <w:rPr>
+                <w:sz w:val="19"/>
+              </w:rPr>
+              <w:t>3450.8ms</w:t>
+            </w:r>
+          </w:p>
+        </w:tc>
+        <w:tc>
+          <w:tcPr>
+            <w:tcW w:type="dxa" w:w="1440"/>
+          </w:tcPr>
+          <w:p>
+            <w:r>
+              <w:rPr>
+                <w:sz w:val="19"/>
+              </w:rPr>
+            </w:r>
+            <w:r>
+              <w:rPr>
+                <w:sz w:val="19"/>
+              </w:rPr>
+              <w:t>3732.7ms</w:t>
+            </w:r>
+          </w:p>
+        </w:tc>
+        <w:tc>
+          <w:tcPr>
+            <w:tcW w:type="dxa" w:w="1440"/>
+          </w:tcPr>
+          <w:p>
+            <w:r>
+              <w:rPr>
+                <w:sz w:val="19"/>
+              </w:rPr>
+            </w:r>
+            <w:r>
+              <w:rPr>
+                <w:sz w:val="19"/>
+              </w:rPr>
+              <w:t>0.29</w:t>
+            </w:r>
+          </w:p>
+        </w:tc>
+        <w:tc>
+          <w:tcPr>
+            <w:tcW w:type="dxa" w:w="1440"/>
+          </w:tcPr>
+          <w:p>
+            <w:r>
+              <w:rPr>
+                <w:sz w:val="19"/>
+              </w:rPr>
+            </w:r>
+            <w:r>
+              <w:rPr>
+                <w:sz w:val="19"/>
+              </w:rPr>
+              <w:t>0.27</w:t>
+            </w:r>
+          </w:p>
+        </w:tc>
+        <w:tc>
+          <w:tcPr>
+            <w:tcW w:type="dxa" w:w="1440"/>
+          </w:tcPr>
+          <w:p>
+            <w:r>
+              <w:rPr>
+                <w:sz w:val="19"/>
+              </w:rPr>
+            </w:r>
+            <w:r>
+              <w:rPr>
+                <w:sz w:val="19"/>
+              </w:rPr>
+              <w:t>4.29</w:t>
+            </w:r>
+          </w:p>
+        </w:tc>
+      </w:tr>
+      <w:tr>
+        <w:tc>
+          <w:tcPr>
+            <w:tcW w:type="dxa" w:w="1440"/>
+          </w:tcPr>
+          <w:p>
+            <w:r>
+              <w:rPr>
+                <w:sz w:val="19"/>
+              </w:rPr>
+            </w:r>
+            <w:r>
+              <w:rPr>
+                <w:sz w:val="19"/>
+              </w:rPr>
+              <w:t>32</w:t>
+            </w:r>
+          </w:p>
+        </w:tc>
+        <w:tc>
+          <w:tcPr>
+            <w:tcW w:type="dxa" w:w="1440"/>
+          </w:tcPr>
+          <w:p>
+            <w:r>
+              <w:rPr>
+                <w:sz w:val="19"/>
+              </w:rPr>
+            </w:r>
+            <w:r>
+              <w:rPr>
+                <w:sz w:val="19"/>
+              </w:rPr>
+              <w:t>28039.8ms</w:t>
+            </w:r>
+          </w:p>
+        </w:tc>
+        <w:tc>
+          <w:tcPr>
+            <w:tcW w:type="dxa" w:w="1440"/>
+          </w:tcPr>
+          <w:p>
+            <w:r>
+              <w:rPr>
+                <w:sz w:val="19"/>
+              </w:rPr>
+            </w:r>
+            <w:r>
+              <w:rPr>
+                <w:sz w:val="19"/>
+              </w:rPr>
+              <w:t>3473.6ms</w:t>
+            </w:r>
+          </w:p>
+        </w:tc>
+        <w:tc>
+          <w:tcPr>
+            <w:tcW w:type="dxa" w:w="1440"/>
+          </w:tcPr>
+          <w:p>
+            <w:r>
+              <w:rPr>
+                <w:sz w:val="19"/>
+              </w:rPr>
+            </w:r>
+            <w:r>
+              <w:rPr>
+                <w:sz w:val="19"/>
+              </w:rPr>
+              <w:t>0.04</w:t>
+            </w:r>
+          </w:p>
+        </w:tc>
+        <w:tc>
+          <w:tcPr>
+            <w:tcW w:type="dxa" w:w="1440"/>
+          </w:tcPr>
+          <w:p>
+            <w:r>
+              <w:rPr>
+                <w:sz w:val="19"/>
+              </w:rPr>
+            </w:r>
+            <w:r>
+              <w:rPr>
+                <w:sz w:val="19"/>
+              </w:rPr>
+              <w:t>0.29</w:t>
+            </w:r>
+          </w:p>
+        </w:tc>
+        <w:tc>
+          <w:tcPr>
+            <w:tcW w:type="dxa" w:w="1440"/>
+          </w:tcPr>
+          <w:p>
+            <w:r>
+              <w:rPr>
+                <w:sz w:val="19"/>
+              </w:rPr>
+            </w:r>
+            <w:r>
+              <w:rPr>
+                <w:b/>
+                <w:sz w:val="19"/>
+              </w:rPr>
+              <w:t>9.21</w:t>
+            </w:r>
+          </w:p>
+        </w:tc>
+      </w:tr>
+    </w:tbl>
+    <w:p/>
+    <w:p>
+      <w:r>
+        <w:t>数据正确性：marker（8→256 全对）、needle（3/3）两组全对；T3 回迁轮事实完整。</w:t>
+      </w:r>
+    </w:p>
+    <w:p>
+      <w:pPr>
+        <w:pStyle w:val="Heading3"/>
+      </w:pPr>
+      <w:r>
+        <w:t>2.7 TTFT / TPS 变化曲线</w:t>
+      </w:r>
+    </w:p>
+    <w:p>
+      <w:pPr>
+        <w:jc w:val="center"/>
+      </w:pPr>
+      <w:r>
+        <w:drawing>
+          <wp:inline xmlns:a="http://schemas.openxmlformats.org/drawingml/2006/main" xmlns:pic="http://schemas.openxmlformats.org/drawingml/2006/picture">
+            <wp:extent cx="5486400" cy="3200400"/>
+            <wp:docPr id="1" name="Picture 1"/>
+            <wp:cNvGraphicFramePr>
+              <a:graphicFrameLocks noChangeAspect="1"/>
+            </wp:cNvGraphicFramePr>
+            <a:graphic>
+              <a:graphicData uri="http://schemas.openxmlformats.org/drawingml/2006/picture">
+                <pic:pic>
+                  <pic:nvPicPr>
+                    <pic:cNvPr id="0" name="fig1_ttft_vs_n.png"/>
+                    <pic:cNvPicPr/>
+                  </pic:nvPicPr>
+                  <pic:blipFill>
+                    <a:blip r:embed="rId9"/>
+                    <a:stretch>
+                      <a:fillRect/>
+                    </a:stretch>
+                  </pic:blipFill>
+                  <pic:spPr>
+                    <a:xfrm>
+                      <a:off x="0" y="0"/>
+                      <a:ext cx="5486400" cy="3200400"/>
+                    </a:xfrm>
+                    <a:prstGeom prst="rect"/>
+                  </pic:spPr>
+                </pic:pic>
+              </a:graphicData>
+            </a:graphic>
+          </wp:inline>
+        </w:drawing>
+      </w:r>
+    </w:p>
+    <w:p>
+      <w:pPr>
+        <w:jc w:val="center"/>
+      </w:pPr>
+      <w:r>
+        <w:rPr>
+          <w:color w:val="606060"/>
+          <w:sz w:val="18"/>
+        </w:rPr>
+        <w:t>图1 TTFT 随并发数变化：cold 两组逐档持平；warm 在 n≤16 因写回开销小幅落后（n=4/8 为 14~28%），n=32 池满场景 HiCache 68.6s vs base 436.1s（6.4×）</w:t>
+      </w:r>
+    </w:p>
+    <w:p>
+      <w:pPr>
+        <w:jc w:val="center"/>
+      </w:pPr>
+      <w:r>
+        <w:drawing>
+          <wp:inline xmlns:a="http://schemas.openxmlformats.org/drawingml/2006/main" xmlns:pic="http://schemas.openxmlformats.org/drawingml/2006/picture">
+            <wp:extent cx="5486400" cy="3200400"/>
+            <wp:docPr id="2" name="Picture 2"/>
+            <wp:cNvGraphicFramePr>
+              <a:graphicFrameLocks noChangeAspect="1"/>
+            </wp:cNvGraphicFramePr>
+            <a:graphic>
+              <a:graphicData uri="http://schemas.openxmlformats.org/drawingml/2006/picture">
+                <pic:pic>
+                  <pic:nvPicPr>
+                    <pic:cNvPr id="0" name="fig2_tps_vs_n.png"/>
+                    <pic:cNvPicPr/>
+                  </pic:nvPicPr>
+                  <pic:blipFill>
+                    <a:blip r:embed="rId10"/>
+                    <a:stretch>
+                      <a:fillRect/>
+                    </a:stretch>
+                  </pic:blipFill>
+                  <pic:spPr>
+                    <a:xfrm>
+                      <a:off x="0" y="0"/>
+                      <a:ext cx="5486400" cy="3200400"/>
+                    </a:xfrm>
+                    <a:prstGeom prst="rect"/>
+                  </pic:spPr>
+                </pic:pic>
+              </a:graphicData>
+            </a:graphic>
+          </wp:inline>
+        </w:drawing>
+      </w:r>
+    </w:p>
+    <w:p>
+      <w:pPr>
+        <w:jc w:val="center"/>
+      </w:pPr>
+      <w:r>
+        <w:rPr>
+          <w:color w:val="606060"/>
+          <w:sz w:val="18"/>
+        </w:rPr>
+        <w:t>图2 解码 TPS 随并发数变化：单会话解码速度由 CPU 专家算力决定（n=1 约 25 tok/s），n=4/8 HiCache 因写回竞争退化约 30%，n=32 池满场景 base 解码崩塌（0.04 tok/s）而 HiCache 保持 0.29 tok/s（聚合 9.2 tok/s，8×）</w:t>
+      </w:r>
+    </w:p>
+    <w:p>
+      <w:pPr>
+        <w:jc w:val="center"/>
+      </w:pPr>
+      <w:r>
+        <w:drawing>
+          <wp:inline xmlns:a="http://schemas.openxmlformats.org/drawingml/2006/main" xmlns:pic="http://schemas.openxmlformats.org/drawingml/2006/picture">
+            <wp:extent cx="5486400" cy="3200400"/>
+            <wp:docPr id="3" name="Picture 3"/>
+            <wp:cNvGraphicFramePr>
+              <a:graphicFrameLocks noChangeAspect="1"/>
+            </wp:cNvGraphicFramePr>
+            <a:graphic>
+              <a:graphicData uri="http://schemas.openxmlformats.org/drawingml/2006/picture">
+                <pic:pic>
+                  <pic:nvPicPr>
+                    <pic:cNvPr id="0" name="fig3_ttft_vs_inputlen.png"/>
+                    <pic:cNvPicPr/>
+                  </pic:nvPicPr>
+                  <pic:blipFill>
+                    <a:blip r:embed="rId11"/>
+                    <a:stretch>
+                      <a:fillRect/>
+                    </a:stretch>
+                  </pic:blipFill>
+                  <pic:spPr>
+                    <a:xfrm>
+                      <a:off x="0" y="0"/>
+                      <a:ext cx="5486400" cy="3200400"/>
+                    </a:xfrm>
+                    <a:prstGeom prst="rect"/>
+                  </pic:spPr>
+                </pic:pic>
+              </a:graphicData>
+            </a:graphic>
+          </wp:inline>
+        </w:drawing>
+      </w:r>
+    </w:p>
+    <w:p>
+      <w:pPr>
+        <w:jc w:val="center"/>
+      </w:pPr>
+      <w:r>
+        <w:rPr>
+          <w:color w:val="606060"/>
+          <w:sz w:val="18"/>
+        </w:rPr>
+        <w:t>图3 TTFT 随输入长度变化（逐轮，n=1/n=32 + T3 12.3k 点位）：两组 cold 曲线重合；池满（n=32）后 HiCache 各轮稳定在 52~136s，base 同轮 266~563s 且逐轮恶化；12.3k 驱逐回迁点 HiCache 0.50s vs base 49.4s</w:t>
+      </w:r>
+    </w:p>
+    <w:p>
+      <w:pPr>
+        <w:jc w:val="center"/>
+      </w:pPr>
+      <w:r>
+        <w:drawing>
+          <wp:inline xmlns:a="http://schemas.openxmlformats.org/drawingml/2006/main" xmlns:pic="http://schemas.openxmlformats.org/drawingml/2006/picture">
+            <wp:extent cx="5486400" cy="3200400"/>
+            <wp:docPr id="4" name="Picture 4"/>
+            <wp:cNvGraphicFramePr>
+              <a:graphicFrameLocks noChangeAspect="1"/>
+            </wp:cNvGraphicFramePr>
+            <a:graphic>
+              <a:graphicData uri="http://schemas.openxmlformats.org/drawingml/2006/picture">
+                <pic:pic>
+                  <pic:nvPicPr>
+                    <pic:cNvPr id="0" name="fig4_tps_vs_inputlen.png"/>
+                    <pic:cNvPicPr/>
+                  </pic:nvPicPr>
+                  <pic:blipFill>
+                    <a:blip r:embed="rId12"/>
+                    <a:stretch>
+                      <a:fillRect/>
+                    </a:stretch>
+                  </pic:blipFill>
+                  <pic:spPr>
+                    <a:xfrm>
+                      <a:off x="0" y="0"/>
+                      <a:ext cx="5486400" cy="3200400"/>
+                    </a:xfrm>
+                    <a:prstGeom prst="rect"/>
+                  </pic:spPr>
+                </pic:pic>
+              </a:graphicData>
+            </a:graphic>
+          </wp:inline>
+        </w:drawing>
+      </w:r>
+    </w:p>
+    <w:p>
+      <w:pPr>
+        <w:jc w:val="center"/>
+      </w:pPr>
+      <w:r>
+        <w:rPr>
+          <w:color w:val="606060"/>
+          <w:sz w:val="18"/>
+        </w:rPr>
+        <w:t>图4 解码 TPS 随输入长度变化（逐轮）：输入变长单会话解码速度缓慢下降（注意力计算量增加）；n=32 池满后 HiCache 各轮解码速度为 base 的 4~10 倍</w:t>
+      </w:r>
+    </w:p>
     <w:p>
       <w:pPr>
         <w:pStyle w:val="Heading2"/>
@@ -3025,6 +5056,29 @@
       </w:r>
       <w:r>
         <w:t>：T4 并发回迁 p50 17.5s vs base 26.1s（1.49 倍），回迁命中率 96.9%；收益受并发带宽竞争制约（见 4.3）。</w:t>
+      </w:r>
+    </w:p>
+    <w:p>
+      <w:pPr>
+        <w:pStyle w:val="ListNumber"/>
+      </w:pPr>
+      <w:r>
+        <w:rPr>
+          <w:b/>
+        </w:rPr>
+        <w:t>解码吞吐在池满场景被稳定保住</w:t>
+      </w:r>
+      <w:r>
+        <w:t>：单会话解码速度由 CPU 专家算力决定（n=1 约 25 tok/s），两组一致；池满场景（n=32）HiCache 组解码 TPOT 3.47s vs base 28.0s（</w:t>
+      </w:r>
+      <w:r>
+        <w:rPr>
+          <w:b/>
+        </w:rPr>
+        <w:t>8×</w:t>
+      </w:r>
+      <w:r>
+        <w:t>），HiCache 同时保住了 TTFT 与解码不崩塌。n=4/8 写回竞争使解码退化约 30%（见 4.5）。</w:t>
       </w:r>
     </w:p>
     <w:p>
@@ -3173,7 +5227,35 @@
         <w:pStyle w:val="Heading3"/>
       </w:pPr>
       <w:r>
-        <w:t>4.5 适用场景建议</w:t>
+        <w:t>4.5 解码 TPOT 曲线解读</w:t>
+      </w:r>
+    </w:p>
+    <w:p>
+      <w:r>
+        <w:t>解码速度的基线由 CPU 专家算力决定：n=1 时 TPOT ≈ 40ms（25 tok/s），与 HiCache 无关（T3 回迁轮 45.0ms vs cold 44.1ms，一致）。两条曲线的分化全部来自</w:t>
+      </w:r>
+      <w:r>
+        <w:rPr>
+          <w:b/>
+        </w:rPr>
+        <w:t>调度干扰</w:t>
+      </w:r>
+      <w:r>
+        <w:t>：n=4/8 时 HiCache 的后台 D2H 迁出与解码争用 CPU/带宽，TPOT 退化约 30%；n=32 池满后 base 组的解码在"重算排队 + retract 重试"下崩塌（TPOT 28.0s），HiCache 组因驱逐内容可回迁，无重算队列，TPOT 稳定在 2.4~4.1s。结论：</w:t>
+      </w:r>
+      <w:r>
+        <w:rPr>
+          <w:b/>
+        </w:rPr>
+        <w:t>HiCache 不提升解码算力上限，但消除了容量不足导致的解码崩塌；中并发段（n=4/8）的写回干扰可通过选择性迁出策略（按前缀命中次数门控 D2H）收敛。</w:t>
+      </w:r>
+    </w:p>
+    <w:p>
+      <w:pPr>
+        <w:pStyle w:val="Heading3"/>
+      </w:pPr>
+      <w:r>
+        <w:t>4.6 适用场景建议</w:t>
       </w:r>
     </w:p>
     <w:tbl>

</xml_diff>